<commit_message>
fix bug preview BA peminjaman
</commit_message>
<xml_diff>
--- a/SistemBeritaAcara.Web/wwwroot/files/templates/BA_Template_Peminjaman.docx
+++ b/SistemBeritaAcara.Web/wwwroot/files/templates/BA_Template_Peminjaman.docx
@@ -1,55 +1,5 @@
 
-<file path=docProps\app.xml><?xml version="1.0" encoding="utf-8"?>
-<Properties xmlns="http://schemas.openxmlformats.org/officeDocument/2006/extended-properties" xmlns:vt="http://schemas.openxmlformats.org/officeDocument/2006/docPropsVTypes">
-  <Template>Normal.dotm</Template>
-  <TotalTime>5</TotalTime>
-  <Pages>3</Pages>
-  <Words>470</Words>
-  <Characters>2684</Characters>
-  <Application>Microsoft Office Word</Application>
-  <DocSecurity>0</DocSecurity>
-  <Lines>22</Lines>
-  <Paragraphs>6</Paragraphs>
-  <ScaleCrop>false</ScaleCrop>
-  <HeadingPairs>
-    <vt:vector size="2" baseType="variant">
-      <vt:variant>
-        <vt:lpstr>Title</vt:lpstr>
-      </vt:variant>
-      <vt:variant>
-        <vt:i4>1</vt:i4>
-      </vt:variant>
-    </vt:vector>
-  </HeadingPairs>
-  <TitlesOfParts>
-    <vt:vector size="1" baseType="lpstr">
-      <vt:lpstr/>
-    </vt:vector>
-  </TitlesOfParts>
-  <Company/>
-  <LinksUpToDate>false</LinksUpToDate>
-  <CharactersWithSpaces>3148</CharactersWithSpaces>
-  <SharedDoc>false</SharedDoc>
-  <HyperlinksChanged>false</HyperlinksChanged>
-  <AppVersion>16.0000</AppVersion>
-</Properties>
-</file>
-
-<file path=docProps\core.xml><?xml version="1.0" encoding="utf-8"?>
-<cp:coreProperties xmlns:cp="http://schemas.openxmlformats.org/package/2006/metadata/core-properties" xmlns:dc="http://purl.org/dc/elements/1.1/" xmlns:dcterms="http://purl.org/dc/terms/" xmlns:dcmitype="http://purl.org/dc/dcmitype/" xmlns:xsi="http://www.w3.org/2001/XMLSchema-instance">
-  <dc:title/>
-  <dc:subject/>
-  <dc:creator>USER</dc:creator>
-  <cp:keywords/>
-  <dc:description/>
-  <cp:lastModifiedBy>USER</cp:lastModifiedBy>
-  <cp:revision>4</cp:revision>
-  <dcterms:created xsi:type="dcterms:W3CDTF">2026-06-16T09:25:00Z</dcterms:created>
-  <dcterms:modified xsi:type="dcterms:W3CDTF">2026-06-18T02:30:00Z</dcterms:modified>
-</cp:coreProperties>
-</file>
-
-<file path=word\document.xml><?xml version="1.0" encoding="utf-8"?>
+<file path=word/document.xml><?xml version="1.0" encoding="utf-8"?>
 <w:document xmlns:wpc="http://schemas.microsoft.com/office/word/2010/wordprocessingCanvas" xmlns:cx="http://schemas.microsoft.com/office/drawing/2014/chartex" xmlns:cx1="http://schemas.microsoft.com/office/drawing/2015/9/8/chartex" xmlns:cx2="http://schemas.microsoft.com/office/drawing/2015/10/21/chartex" xmlns:cx3="http://schemas.microsoft.com/office/drawing/2016/5/9/chartex" xmlns:cx4="http://schemas.microsoft.com/office/drawing/2016/5/10/chartex" xmlns:cx5="http://schemas.microsoft.com/office/drawing/2016/5/11/chartex" xmlns:cx6="http://schemas.microsoft.com/office/drawing/2016/5/12/chartex" xmlns:cx7="http://schemas.microsoft.com/office/drawing/2016/5/13/chartex" xmlns:cx8="http://schemas.microsoft.com/office/drawing/2016/5/14/chartex" xmlns:mc="http://schemas.openxmlformats.org/markup-compatibility/2006" xmlns:aink="http://schemas.microsoft.com/office/drawing/2016/ink" xmlns:am3d="http://schemas.microsoft.com/office/drawing/2017/model3d" xmlns:o="urn:schemas-microsoft-com:office:office" xmlns:oel="http://schemas.microsoft.com/office/2019/extlst" xmlns:r="http://schemas.openxmlformats.org/officeDocument/2006/relationships" xmlns:m="http://schemas.openxmlformats.org/officeDocument/2006/math" xmlns:v="urn:schemas-microsoft-com:vml" xmlns:wp14="http://schemas.microsoft.com/office/word/2010/wordprocessingDrawing" xmlns:wp="http://schemas.openxmlformats.org/drawingml/2006/wordprocessingDrawing" xmlns:w10="urn:schemas-microsoft-com:office:word" xmlns:w="http://schemas.openxmlformats.org/wordprocessingml/2006/main" xmlns:w14="http://schemas.microsoft.com/office/word/2010/wordml" xmlns:w15="http://schemas.microsoft.com/office/word/2012/wordml" xmlns:w16cex="http://schemas.microsoft.com/office/word/2018/wordml/cex" xmlns:w16cid="http://schemas.microsoft.com/office/word/2016/wordml/cid" xmlns:w16="http://schemas.microsoft.com/office/word/2018/wordml" xmlns:w16du="http://schemas.microsoft.com/office/word/2023/wordml/word16du" xmlns:w16sdtdh="http://schemas.microsoft.com/office/word/2020/wordml/sdtdatahash" xmlns:w16sdtfl="http://schemas.microsoft.com/office/word/2024/wordml/sdtformatlock" xmlns:w16se="http://schemas.microsoft.com/office/word/2015/wordml/symex" xmlns:wpg="http://schemas.microsoft.com/office/word/2010/wordprocessingGroup" xmlns:wpi="http://schemas.microsoft.com/office/word/2010/wordprocessingInk" xmlns:wne="http://schemas.microsoft.com/office/word/2006/wordml" xmlns:wps="http://schemas.microsoft.com/office/word/2010/wordprocessingShape" mc:Ignorable="w14 w15 w16se w16cid w16 w16cex w16sdtdh w16sdtfl w16du wp14">
   <w:body>
     <w:tbl>
@@ -87,17 +37,9 @@
                 <w:noProof/>
               </w:rPr>
               <w:drawing>
-                <wp:anchor distT="0" distB="0" distL="114300" distR="114300" simplePos="0" relativeHeight="251658240" behindDoc="0" locked="0" layoutInCell="1" allowOverlap="1" wp14:anchorId="3CBE1705" wp14:editId="5284D196">
-                  <wp:simplePos x="0" y="0"/>
-                  <wp:positionH relativeFrom="column">
-                    <wp:posOffset>-159385</wp:posOffset>
-                  </wp:positionH>
-                  <wp:positionV relativeFrom="paragraph">
-                    <wp:posOffset>-98425</wp:posOffset>
-                  </wp:positionV>
-                  <wp:extent cx="1185756" cy="348343"/>
+                <wp:inline distT="0" distB="0" distL="0" distR="0" wp14:anchorId="3CBE1705" wp14:editId="0F43DA6D">
+                  <wp:extent cx="977676" cy="287215"/>
                   <wp:effectExtent l="0" t="0" r="0" b="0"/>
-                  <wp:wrapNone/>
                   <wp:docPr id="2091714517" name="Picture 1" descr="PT Pertamina Patra Niaga Logo Vector"/>
                   <wp:cNvGraphicFramePr>
                     <a:graphicFrameLocks xmlns:a="http://schemas.openxmlformats.org/drawingml/2006/main" noChangeAspect="1"/>
@@ -127,7 +69,7 @@
                         <pic:spPr bwMode="auto">
                           <a:xfrm>
                             <a:off x="0" y="0"/>
-                            <a:ext cx="1185756" cy="348343"/>
+                            <a:ext cx="1023252" cy="300604"/>
                           </a:xfrm>
                           <a:prstGeom prst="rect">
                             <a:avLst/>
@@ -145,13 +87,7 @@
                       </pic:pic>
                     </a:graphicData>
                   </a:graphic>
-                  <wp14:sizeRelH relativeFrom="margin">
-                    <wp14:pctWidth>0</wp14:pctWidth>
-                  </wp14:sizeRelH>
-                  <wp14:sizeRelV relativeFrom="margin">
-                    <wp14:pctHeight>0</wp14:pctHeight>
-                  </wp14:sizeRelV>
-                </wp:anchor>
+                </wp:inline>
               </w:drawing>
             </w:r>
           </w:p>
@@ -220,7 +156,15 @@
               </w:rPr>
             </w:pPr>
             <w:r>
-              <w:t xml:space="preserve">Gd. Wisma Tugu II Lt. 2 Jl. </w:t>
+              <w:t xml:space="preserve">Gd. Wisma </w:t>
+            </w:r>
+            <w:proofErr w:type="spellStart"/>
+            <w:r>
+              <w:t>Tugu</w:t>
+            </w:r>
+            <w:proofErr w:type="spellEnd"/>
+            <w:r>
+              <w:t xml:space="preserve"> II Lt. 2 Jl. </w:t>
             </w:r>
             <w:r>
               <w:rPr>
@@ -284,19 +228,20 @@
               <w:tblStyle w:val="TableGrid"/>
               <w:tblW w:w="0" w:type="auto"/>
               <w:tblBorders>
+                <w:insideH w:val="none" w:sz="0" w:space="0" w:color="auto"/>
                 <w:insideV w:val="none" w:sz="0" w:space="0" w:color="auto"/>
               </w:tblBorders>
               <w:tblLook w:val="04A0" w:firstRow="1" w:lastRow="0" w:firstColumn="1" w:lastColumn="0" w:noHBand="0" w:noVBand="1"/>
             </w:tblPr>
             <w:tblGrid>
-              <w:gridCol w:w="885"/>
+              <w:gridCol w:w="1466"/>
               <w:gridCol w:w="272"/>
-              <w:gridCol w:w="3302"/>
+              <w:gridCol w:w="2719"/>
             </w:tblGrid>
             <w:tr>
               <w:tc>
                 <w:tcPr>
-                  <w:tcW w:w="885" w:type="dxa"/>
+                  <w:tcW w:w="1485" w:type="dxa"/>
                 </w:tcPr>
                 <w:p>
                   <w:pPr>
@@ -318,7 +263,7 @@
               </w:tc>
               <w:tc>
                 <w:tcPr>
-                  <w:tcW w:w="270" w:type="dxa"/>
+                  <w:tcW w:w="236" w:type="dxa"/>
                 </w:tcPr>
                 <w:p>
                   <w:pPr>
@@ -336,7 +281,7 @@
               </w:tc>
               <w:tc>
                 <w:tcPr>
-                  <w:tcW w:w="3302" w:type="dxa"/>
+                  <w:tcW w:w="2736" w:type="dxa"/>
                 </w:tcPr>
                 <w:p>
                   <w:pPr>
@@ -360,7 +305,7 @@
             <w:tr>
               <w:tc>
                 <w:tcPr>
-                  <w:tcW w:w="885" w:type="dxa"/>
+                  <w:tcW w:w="1485" w:type="dxa"/>
                 </w:tcPr>
                 <w:p>
                   <w:pPr>
@@ -382,7 +327,7 @@
               </w:tc>
               <w:tc>
                 <w:tcPr>
-                  <w:tcW w:w="270" w:type="dxa"/>
+                  <w:tcW w:w="236" w:type="dxa"/>
                 </w:tcPr>
                 <w:p>
                   <w:pPr>
@@ -400,7 +345,7 @@
               </w:tc>
               <w:tc>
                 <w:tcPr>
-                  <w:tcW w:w="3302" w:type="dxa"/>
+                  <w:tcW w:w="2736" w:type="dxa"/>
                 </w:tcPr>
                 <w:p>
                   <w:pPr>
@@ -424,7 +369,7 @@
             <w:tr>
               <w:tc>
                 <w:tcPr>
-                  <w:tcW w:w="885" w:type="dxa"/>
+                  <w:tcW w:w="1485" w:type="dxa"/>
                 </w:tcPr>
                 <w:p>
                   <w:pPr>
@@ -446,7 +391,7 @@
               </w:tc>
               <w:tc>
                 <w:tcPr>
-                  <w:tcW w:w="270" w:type="dxa"/>
+                  <w:tcW w:w="236" w:type="dxa"/>
                 </w:tcPr>
                 <w:p>
                   <w:pPr>
@@ -464,7 +409,7 @@
               </w:tc>
               <w:tc>
                 <w:tcPr>
-                  <w:tcW w:w="3302" w:type="dxa"/>
+                  <w:tcW w:w="2736" w:type="dxa"/>
                 </w:tcPr>
                 <w:p>
                   <w:pPr>
@@ -488,7 +433,7 @@
             <w:tr>
               <w:tc>
                 <w:tcPr>
-                  <w:tcW w:w="885" w:type="dxa"/>
+                  <w:tcW w:w="1485" w:type="dxa"/>
                 </w:tcPr>
                 <w:p>
                   <w:pPr>
@@ -510,7 +455,7 @@
               </w:tc>
               <w:tc>
                 <w:tcPr>
-                  <w:tcW w:w="270" w:type="dxa"/>
+                  <w:tcW w:w="236" w:type="dxa"/>
                 </w:tcPr>
                 <w:p>
                   <w:pPr>
@@ -528,7 +473,7 @@
               </w:tc>
               <w:tc>
                 <w:tcPr>
-                  <w:tcW w:w="3302" w:type="dxa"/>
+                  <w:tcW w:w="2736" w:type="dxa"/>
                 </w:tcPr>
                 <w:p>
                   <w:pPr>
@@ -601,14 +546,14 @@
         <w:tblLook w:val="04A0" w:firstRow="1" w:lastRow="0" w:firstColumn="1" w:lastColumn="0" w:noHBand="0" w:noVBand="1"/>
       </w:tblPr>
       <w:tblGrid>
-        <w:gridCol w:w="3055"/>
+        <w:gridCol w:w="2785"/>
         <w:gridCol w:w="270"/>
-        <w:gridCol w:w="5803"/>
+        <w:gridCol w:w="6073"/>
       </w:tblGrid>
       <w:tr>
         <w:tc>
           <w:tcPr>
-            <w:tcW w:w="3055" w:type="dxa"/>
+            <w:tcW w:w="2785" w:type="dxa"/>
             <w:tcMar>
               <w:top w:w="60" w:type="dxa"/>
               <w:left w:w="80" w:type="dxa"/>
@@ -618,18 +563,33 @@
           </w:tcPr>
           <w:p>
             <w:pPr>
-              <w:ind w:left="274"/>
-              <w:rPr>
-                <w:sz w:val="18"/>
-                <w:szCs w:val="18"/>
-              </w:rPr>
-            </w:pPr>
-            <w:r>
-              <w:rPr>
-                <w:sz w:val="18"/>
-                <w:szCs w:val="18"/>
-              </w:rPr>
-              <w:t>Nama Penanggung Jawab</w:t>
+              <w:rPr>
+                <w:sz w:val="18"/>
+                <w:szCs w:val="18"/>
+              </w:rPr>
+            </w:pPr>
+            <w:r>
+              <w:rPr>
+                <w:sz w:val="18"/>
+                <w:szCs w:val="18"/>
+              </w:rPr>
+              <w:t xml:space="preserve">Nama </w:t>
+            </w:r>
+            <w:proofErr w:type="spellStart"/>
+            <w:r>
+              <w:rPr>
+                <w:sz w:val="18"/>
+                <w:szCs w:val="18"/>
+              </w:rPr>
+              <w:t>Penanggung</w:t>
+            </w:r>
+            <w:proofErr w:type="spellEnd"/>
+            <w:r>
+              <w:rPr>
+                <w:sz w:val="18"/>
+                <w:szCs w:val="18"/>
+              </w:rPr>
+              <w:t xml:space="preserve"> Jawab</w:t>
             </w:r>
           </w:p>
         </w:tc>
@@ -662,7 +622,7 @@
         </w:tc>
         <w:tc>
           <w:tcPr>
-            <w:tcW w:w="5803" w:type="dxa"/>
+            <w:tcW w:w="6073" w:type="dxa"/>
             <w:tcMar>
               <w:top w:w="60" w:type="dxa"/>
               <w:left w:w="80" w:type="dxa"/>
@@ -690,7 +650,7 @@
       <w:tr>
         <w:tc>
           <w:tcPr>
-            <w:tcW w:w="3055" w:type="dxa"/>
+            <w:tcW w:w="2785" w:type="dxa"/>
             <w:tcMar>
               <w:top w:w="60" w:type="dxa"/>
               <w:left w:w="80" w:type="dxa"/>
@@ -700,7 +660,6 @@
           </w:tcPr>
           <w:p>
             <w:pPr>
-              <w:ind w:left="274"/>
               <w:rPr>
                 <w:sz w:val="18"/>
                 <w:szCs w:val="18"/>
@@ -744,7 +703,7 @@
         </w:tc>
         <w:tc>
           <w:tcPr>
-            <w:tcW w:w="5803" w:type="dxa"/>
+            <w:tcW w:w="6073" w:type="dxa"/>
             <w:tcMar>
               <w:top w:w="60" w:type="dxa"/>
               <w:left w:w="80" w:type="dxa"/>
@@ -772,7 +731,7 @@
       <w:tr>
         <w:tc>
           <w:tcPr>
-            <w:tcW w:w="3055" w:type="dxa"/>
+            <w:tcW w:w="2785" w:type="dxa"/>
             <w:tcMar>
               <w:top w:w="60" w:type="dxa"/>
               <w:left w:w="80" w:type="dxa"/>
@@ -782,7 +741,6 @@
           </w:tcPr>
           <w:p>
             <w:pPr>
-              <w:ind w:left="274"/>
               <w:rPr>
                 <w:sz w:val="18"/>
                 <w:szCs w:val="18"/>
@@ -826,7 +784,7 @@
         </w:tc>
         <w:tc>
           <w:tcPr>
-            <w:tcW w:w="5803" w:type="dxa"/>
+            <w:tcW w:w="6073" w:type="dxa"/>
             <w:tcMar>
               <w:top w:w="60" w:type="dxa"/>
               <w:left w:w="80" w:type="dxa"/>
@@ -854,7 +812,7 @@
       <w:tr>
         <w:tc>
           <w:tcPr>
-            <w:tcW w:w="3055" w:type="dxa"/>
+            <w:tcW w:w="2785" w:type="dxa"/>
             <w:tcMar>
               <w:top w:w="60" w:type="dxa"/>
               <w:left w:w="80" w:type="dxa"/>
@@ -864,19 +822,36 @@
           </w:tcPr>
           <w:p>
             <w:pPr>
-              <w:ind w:left="274"/>
-              <w:rPr>
-                <w:sz w:val="18"/>
-                <w:szCs w:val="18"/>
-              </w:rPr>
-            </w:pPr>
-            <w:r>
-              <w:rPr>
-                <w:sz w:val="18"/>
-                <w:szCs w:val="18"/>
-              </w:rPr>
-              <w:t>Fungsi/Direktorat</w:t>
-            </w:r>
+              <w:rPr>
+                <w:sz w:val="18"/>
+                <w:szCs w:val="18"/>
+              </w:rPr>
+            </w:pPr>
+            <w:proofErr w:type="spellStart"/>
+            <w:r>
+              <w:rPr>
+                <w:sz w:val="18"/>
+                <w:szCs w:val="18"/>
+              </w:rPr>
+              <w:t>Fungsi</w:t>
+            </w:r>
+            <w:proofErr w:type="spellEnd"/>
+            <w:r>
+              <w:rPr>
+                <w:sz w:val="18"/>
+                <w:szCs w:val="18"/>
+              </w:rPr>
+              <w:t>/</w:t>
+            </w:r>
+            <w:proofErr w:type="spellStart"/>
+            <w:r>
+              <w:rPr>
+                <w:sz w:val="18"/>
+                <w:szCs w:val="18"/>
+              </w:rPr>
+              <w:t>Direktorat</w:t>
+            </w:r>
+            <w:proofErr w:type="spellEnd"/>
           </w:p>
         </w:tc>
         <w:tc>
@@ -908,7 +883,7 @@
         </w:tc>
         <w:tc>
           <w:tcPr>
-            <w:tcW w:w="5803" w:type="dxa"/>
+            <w:tcW w:w="6073" w:type="dxa"/>
             <w:tcMar>
               <w:top w:w="60" w:type="dxa"/>
               <w:left w:w="80" w:type="dxa"/>
@@ -928,15 +903,24 @@
                 <w:sz w:val="18"/>
                 <w:szCs w:val="18"/>
               </w:rPr>
-              <w:t>{{FungsiPJ}}</w:t>
-            </w:r>
+              <w:t xml:space="preserve">{{FungsiPJ}}</w:t>
+            </w:r>
+            <w:proofErr w:type="spellStart"/>
+            <w:r>
+              <w:rPr>
+                <w:sz w:val="18"/>
+                <w:szCs w:val="18"/>
+              </w:rPr>
+              <w:t/>
+            </w:r>
+            <w:proofErr w:type="spellEnd"/>
           </w:p>
         </w:tc>
       </w:tr>
       <w:tr>
         <w:tc>
           <w:tcPr>
-            <w:tcW w:w="3055" w:type="dxa"/>
+            <w:tcW w:w="2785" w:type="dxa"/>
             <w:tcMar>
               <w:top w:w="60" w:type="dxa"/>
               <w:left w:w="80" w:type="dxa"/>
@@ -946,7 +930,6 @@
           </w:tcPr>
           <w:p>
             <w:pPr>
-              <w:ind w:left="274"/>
               <w:rPr>
                 <w:sz w:val="18"/>
                 <w:szCs w:val="18"/>
@@ -990,7 +973,7 @@
         </w:tc>
         <w:tc>
           <w:tcPr>
-            <w:tcW w:w="5803" w:type="dxa"/>
+            <w:tcW w:w="6073" w:type="dxa"/>
             <w:tcMar>
               <w:top w:w="60" w:type="dxa"/>
               <w:left w:w="80" w:type="dxa"/>
@@ -1010,15 +993,24 @@
                 <w:sz w:val="18"/>
                 <w:szCs w:val="18"/>
               </w:rPr>
-              <w:t>{{FungsiPJ}}</w:t>
-            </w:r>
+              <w:t xml:space="preserve">{{FungsiPJ}}</w:t>
+            </w:r>
+            <w:proofErr w:type="spellStart"/>
+            <w:r>
+              <w:rPr>
+                <w:sz w:val="18"/>
+                <w:szCs w:val="18"/>
+              </w:rPr>
+              <w:t/>
+            </w:r>
+            <w:proofErr w:type="spellEnd"/>
           </w:p>
         </w:tc>
       </w:tr>
       <w:tr>
         <w:tc>
           <w:tcPr>
-            <w:tcW w:w="3055" w:type="dxa"/>
+            <w:tcW w:w="2785" w:type="dxa"/>
             <w:tcMar>
               <w:top w:w="60" w:type="dxa"/>
               <w:left w:w="80" w:type="dxa"/>
@@ -1028,7 +1020,6 @@
           </w:tcPr>
           <w:p>
             <w:pPr>
-              <w:ind w:left="274"/>
               <w:rPr>
                 <w:sz w:val="18"/>
                 <w:szCs w:val="18"/>
@@ -1072,7 +1063,7 @@
         </w:tc>
         <w:tc>
           <w:tcPr>
-            <w:tcW w:w="5803" w:type="dxa"/>
+            <w:tcW w:w="6073" w:type="dxa"/>
             <w:tcMar>
               <w:top w:w="60" w:type="dxa"/>
               <w:left w:w="80" w:type="dxa"/>
@@ -1100,7 +1091,7 @@
       <w:tr>
         <w:tc>
           <w:tcPr>
-            <w:tcW w:w="3055" w:type="dxa"/>
+            <w:tcW w:w="2785" w:type="dxa"/>
             <w:tcMar>
               <w:top w:w="60" w:type="dxa"/>
               <w:left w:w="80" w:type="dxa"/>
@@ -1110,19 +1101,27 @@
           </w:tcPr>
           <w:p>
             <w:pPr>
-              <w:ind w:left="274"/>
-              <w:rPr>
-                <w:sz w:val="18"/>
-                <w:szCs w:val="18"/>
-              </w:rPr>
-            </w:pPr>
-            <w:r>
-              <w:rPr>
-                <w:sz w:val="18"/>
-                <w:szCs w:val="18"/>
-              </w:rPr>
-              <w:t>No. Pekerja</w:t>
-            </w:r>
+              <w:rPr>
+                <w:sz w:val="18"/>
+                <w:szCs w:val="18"/>
+              </w:rPr>
+            </w:pPr>
+            <w:r>
+              <w:rPr>
+                <w:sz w:val="18"/>
+                <w:szCs w:val="18"/>
+              </w:rPr>
+              <w:t xml:space="preserve">No. </w:t>
+            </w:r>
+            <w:proofErr w:type="spellStart"/>
+            <w:r>
+              <w:rPr>
+                <w:sz w:val="18"/>
+                <w:szCs w:val="18"/>
+              </w:rPr>
+              <w:t>Pekerja</w:t>
+            </w:r>
+            <w:proofErr w:type="spellEnd"/>
           </w:p>
         </w:tc>
         <w:tc>
@@ -1154,7 +1153,7 @@
         </w:tc>
         <w:tc>
           <w:tcPr>
-            <w:tcW w:w="5803" w:type="dxa"/>
+            <w:tcW w:w="6073" w:type="dxa"/>
             <w:tcMar>
               <w:top w:w="60" w:type="dxa"/>
               <w:left w:w="80" w:type="dxa"/>
@@ -1182,7 +1181,7 @@
       <w:tr>
         <w:tc>
           <w:tcPr>
-            <w:tcW w:w="3055" w:type="dxa"/>
+            <w:tcW w:w="2785" w:type="dxa"/>
             <w:tcMar>
               <w:top w:w="60" w:type="dxa"/>
               <w:left w:w="80" w:type="dxa"/>
@@ -1192,7 +1191,6 @@
           </w:tcPr>
           <w:p>
             <w:pPr>
-              <w:ind w:left="274"/>
               <w:rPr>
                 <w:sz w:val="18"/>
                 <w:szCs w:val="18"/>
@@ -1236,7 +1234,7 @@
         </w:tc>
         <w:tc>
           <w:tcPr>
-            <w:tcW w:w="5803" w:type="dxa"/>
+            <w:tcW w:w="6073" w:type="dxa"/>
             <w:tcMar>
               <w:top w:w="60" w:type="dxa"/>
               <w:left w:w="80" w:type="dxa"/>
@@ -1270,13 +1268,13 @@
     <w:p>
       <w:pPr>
         <w:spacing w:line="276" w:lineRule="auto"/>
-        <w:ind w:left="360"/>
         <w:jc w:val="both"/>
         <w:rPr>
           <w:b/>
           <w:bCs/>
           <w:sz w:val="18"/>
           <w:szCs w:val="18"/>
+          <w:lang w:val="nb-NO"/>
         </w:rPr>
       </w:pPr>
       <w:r>
@@ -1285,46 +1283,47 @@
           <w:bCs/>
           <w:sz w:val="18"/>
           <w:szCs w:val="18"/>
-        </w:rPr>
-        <w:t xml:space="preserve">Pada </w:t>
-      </w:r>
-      <w:proofErr w:type="spellStart"/>
+          <w:lang w:val="nb-NO"/>
+        </w:rPr>
+        <w:t xml:space="preserve">Pada hari ini </w:t>
+      </w:r>
       <w:r>
         <w:rPr>
           <w:b/>
           <w:bCs/>
           <w:sz w:val="18"/>
           <w:szCs w:val="18"/>
-        </w:rPr>
-        <w:t>hari</w:t>
-      </w:r>
-      <w:proofErr w:type="spellEnd"/>
+          <w:lang w:val="nb-NO"/>
+        </w:rPr>
+        <w:t>{{HariTanggal}}</w:t>
+      </w:r>
       <w:r>
         <w:rPr>
           <w:b/>
           <w:bCs/>
           <w:sz w:val="18"/>
           <w:szCs w:val="18"/>
-        </w:rPr>
-        <w:t xml:space="preserve"> </w:t>
-      </w:r>
-      <w:proofErr w:type="spellStart"/>
+          <w:lang w:val="nb-NO"/>
+        </w:rPr>
+        <w:t xml:space="preserve"> Tanggal </w:t>
+      </w:r>
       <w:r>
         <w:rPr>
           <w:b/>
           <w:bCs/>
           <w:sz w:val="18"/>
           <w:szCs w:val="18"/>
-        </w:rPr>
-        <w:t>ini</w:t>
-      </w:r>
-      <w:proofErr w:type="spellEnd"/>
+          <w:lang w:val="nb-NO"/>
+        </w:rPr>
+        <w:t>{{TanggalAngka}}</w:t>
+      </w:r>
       <w:r>
         <w:rPr>
           <w:b/>
           <w:bCs/>
           <w:sz w:val="18"/>
           <w:szCs w:val="18"/>
+          <w:lang w:val="nb-NO"/>
         </w:rPr>
         <w:t xml:space="preserve"> </w:t>
       </w:r>
@@ -1334,353 +1333,19 @@
           <w:bCs/>
           <w:sz w:val="18"/>
           <w:szCs w:val="18"/>
-        </w:rPr>
-        <w:t>{{</w:t>
-      </w:r>
-      <w:proofErr w:type="spellStart"/>
+          <w:lang w:val="nb-NO"/>
+        </w:rPr>
+        <w:t>{{BulanTanggal}}</w:t>
+      </w:r>
       <w:r>
         <w:rPr>
           <w:b/>
           <w:bCs/>
           <w:sz w:val="18"/>
           <w:szCs w:val="18"/>
-        </w:rPr>
-        <w:t>HariTanggal</w:t>
-      </w:r>
-      <w:proofErr w:type="spellEnd"/>
-      <w:r>
-        <w:rPr>
-          <w:b/>
-          <w:bCs/>
-          <w:sz w:val="18"/>
-          <w:szCs w:val="18"/>
-        </w:rPr>
-        <w:t>}}</w:t>
-      </w:r>
-      <w:r>
-        <w:rPr>
-          <w:b/>
-          <w:bCs/>
-          <w:sz w:val="18"/>
-          <w:szCs w:val="18"/>
-        </w:rPr>
-        <w:t xml:space="preserve"> </w:t>
-      </w:r>
-      <w:proofErr w:type="spellStart"/>
-      <w:r>
-        <w:rPr>
-          <w:b/>
-          <w:bCs/>
-          <w:sz w:val="18"/>
-          <w:szCs w:val="18"/>
-        </w:rPr>
-        <w:t>Tanggal</w:t>
-      </w:r>
-      <w:proofErr w:type="spellEnd"/>
-      <w:r>
-        <w:rPr>
-          <w:b/>
-          <w:bCs/>
-          <w:sz w:val="18"/>
-          <w:szCs w:val="18"/>
-        </w:rPr>
-        <w:t xml:space="preserve"> </w:t>
-      </w:r>
-      <w:r>
-        <w:rPr>
-          <w:b/>
-          <w:bCs/>
-          <w:sz w:val="18"/>
-          <w:szCs w:val="18"/>
-        </w:rPr>
-        <w:t>{{</w:t>
-      </w:r>
-      <w:proofErr w:type="spellStart"/>
-      <w:r>
-        <w:rPr>
-          <w:b/>
-          <w:bCs/>
-          <w:sz w:val="18"/>
-          <w:szCs w:val="18"/>
-        </w:rPr>
-        <w:t>TanggalAngka</w:t>
-      </w:r>
-      <w:proofErr w:type="spellEnd"/>
-      <w:r>
-        <w:rPr>
-          <w:b/>
-          <w:bCs/>
-          <w:sz w:val="18"/>
-          <w:szCs w:val="18"/>
-        </w:rPr>
-        <w:t>}}</w:t>
-      </w:r>
-      <w:r>
-        <w:rPr>
-          <w:b/>
-          <w:bCs/>
-          <w:sz w:val="18"/>
-          <w:szCs w:val="18"/>
-        </w:rPr>
-        <w:t xml:space="preserve"> </w:t>
-      </w:r>
-      <w:r>
-        <w:rPr>
-          <w:b/>
-          <w:bCs/>
-          <w:sz w:val="18"/>
-          <w:szCs w:val="18"/>
-        </w:rPr>
-        <w:t>{{</w:t>
-      </w:r>
-      <w:proofErr w:type="spellStart"/>
-      <w:r>
-        <w:rPr>
-          <w:b/>
-          <w:bCs/>
-          <w:sz w:val="18"/>
-          <w:szCs w:val="18"/>
-        </w:rPr>
-        <w:t>BulanTanggal</w:t>
-      </w:r>
-      <w:proofErr w:type="spellEnd"/>
-      <w:r>
-        <w:rPr>
-          <w:b/>
-          <w:bCs/>
-          <w:sz w:val="18"/>
-          <w:szCs w:val="18"/>
-        </w:rPr>
-        <w:t>}}</w:t>
-      </w:r>
-      <w:r>
-        <w:rPr>
-          <w:b/>
-          <w:bCs/>
-          <w:sz w:val="18"/>
-          <w:szCs w:val="18"/>
-        </w:rPr>
-        <w:t xml:space="preserve"> {{</w:t>
-      </w:r>
-      <w:proofErr w:type="spellStart"/>
-      <w:r>
-        <w:rPr>
-          <w:b/>
-          <w:bCs/>
-          <w:sz w:val="18"/>
-          <w:szCs w:val="18"/>
-        </w:rPr>
-        <w:t>TahunTanggal</w:t>
-      </w:r>
-      <w:proofErr w:type="spellEnd"/>
-      <w:r>
-        <w:rPr>
-          <w:b/>
-          <w:bCs/>
-          <w:sz w:val="18"/>
-          <w:szCs w:val="18"/>
-        </w:rPr>
-        <w:t xml:space="preserve">}} </w:t>
-      </w:r>
-      <w:proofErr w:type="spellStart"/>
-      <w:r>
-        <w:rPr>
-          <w:b/>
-          <w:bCs/>
-          <w:sz w:val="18"/>
-          <w:szCs w:val="18"/>
-        </w:rPr>
-        <w:t>telah</w:t>
-      </w:r>
-      <w:proofErr w:type="spellEnd"/>
-      <w:r>
-        <w:rPr>
-          <w:b/>
-          <w:bCs/>
-          <w:sz w:val="18"/>
-          <w:szCs w:val="18"/>
-        </w:rPr>
-        <w:t xml:space="preserve"> </w:t>
-      </w:r>
-      <w:proofErr w:type="spellStart"/>
-      <w:r>
-        <w:rPr>
-          <w:b/>
-          <w:bCs/>
-          <w:sz w:val="18"/>
-          <w:szCs w:val="18"/>
-        </w:rPr>
-        <w:t>diserahterimakan</w:t>
-      </w:r>
-      <w:proofErr w:type="spellEnd"/>
-      <w:r>
-        <w:rPr>
-          <w:b/>
-          <w:bCs/>
-          <w:sz w:val="18"/>
-          <w:szCs w:val="18"/>
-        </w:rPr>
-        <w:t xml:space="preserve"> </w:t>
-      </w:r>
-      <w:proofErr w:type="spellStart"/>
-      <w:r>
-        <w:rPr>
-          <w:b/>
-          <w:bCs/>
-          <w:sz w:val="18"/>
-          <w:szCs w:val="18"/>
-        </w:rPr>
-        <w:t>perangkat</w:t>
-      </w:r>
-      <w:proofErr w:type="spellEnd"/>
-      <w:r>
-        <w:rPr>
-          <w:b/>
-          <w:bCs/>
-          <w:sz w:val="18"/>
-          <w:szCs w:val="18"/>
-        </w:rPr>
-        <w:t xml:space="preserve"> </w:t>
-      </w:r>
-      <w:proofErr w:type="spellStart"/>
-      <w:r>
-        <w:rPr>
-          <w:b/>
-          <w:bCs/>
-          <w:sz w:val="18"/>
-          <w:szCs w:val="18"/>
-        </w:rPr>
-        <w:t>dengan</w:t>
-      </w:r>
-      <w:proofErr w:type="spellEnd"/>
-      <w:r>
-        <w:rPr>
-          <w:b/>
-          <w:bCs/>
-          <w:sz w:val="18"/>
-          <w:szCs w:val="18"/>
-        </w:rPr>
-        <w:t xml:space="preserve"> </w:t>
-      </w:r>
-      <w:proofErr w:type="spellStart"/>
-      <w:r>
-        <w:rPr>
-          <w:b/>
-          <w:bCs/>
-          <w:sz w:val="18"/>
-          <w:szCs w:val="18"/>
-        </w:rPr>
-        <w:t>spesifikasi</w:t>
-      </w:r>
-      <w:proofErr w:type="spellEnd"/>
-      <w:r>
-        <w:rPr>
-          <w:b/>
-          <w:bCs/>
-          <w:sz w:val="18"/>
-          <w:szCs w:val="18"/>
-        </w:rPr>
-        <w:t xml:space="preserve"> </w:t>
-      </w:r>
-      <w:proofErr w:type="spellStart"/>
-      <w:r>
-        <w:rPr>
-          <w:b/>
-          <w:bCs/>
-          <w:sz w:val="18"/>
-          <w:szCs w:val="18"/>
-        </w:rPr>
-        <w:t>serta</w:t>
-      </w:r>
-      <w:proofErr w:type="spellEnd"/>
-      <w:r>
-        <w:rPr>
-          <w:b/>
-          <w:bCs/>
-          <w:sz w:val="18"/>
-          <w:szCs w:val="18"/>
-        </w:rPr>
-        <w:t xml:space="preserve"> </w:t>
-      </w:r>
-      <w:proofErr w:type="spellStart"/>
-      <w:r>
-        <w:rPr>
-          <w:b/>
-          <w:bCs/>
-          <w:sz w:val="18"/>
-          <w:szCs w:val="18"/>
-        </w:rPr>
-        <w:t>syarat-syarat</w:t>
-      </w:r>
-      <w:proofErr w:type="spellEnd"/>
-      <w:r>
-        <w:rPr>
-          <w:b/>
-          <w:bCs/>
-          <w:sz w:val="18"/>
-          <w:szCs w:val="18"/>
-        </w:rPr>
-        <w:t xml:space="preserve"> dan </w:t>
-      </w:r>
-      <w:proofErr w:type="spellStart"/>
-      <w:r>
-        <w:rPr>
-          <w:b/>
-          <w:bCs/>
-          <w:sz w:val="18"/>
-          <w:szCs w:val="18"/>
-        </w:rPr>
-        <w:t>ketentuan</w:t>
-      </w:r>
-      <w:proofErr w:type="spellEnd"/>
-      <w:r>
-        <w:rPr>
-          <w:b/>
-          <w:bCs/>
-          <w:sz w:val="18"/>
-          <w:szCs w:val="18"/>
-        </w:rPr>
-        <w:t xml:space="preserve"> </w:t>
-      </w:r>
-      <w:proofErr w:type="spellStart"/>
-      <w:r>
-        <w:rPr>
-          <w:b/>
-          <w:bCs/>
-          <w:sz w:val="18"/>
-          <w:szCs w:val="18"/>
-        </w:rPr>
-        <w:t>sebagai</w:t>
-      </w:r>
-      <w:proofErr w:type="spellEnd"/>
-      <w:r>
-        <w:rPr>
-          <w:b/>
-          <w:bCs/>
-          <w:sz w:val="18"/>
-          <w:szCs w:val="18"/>
-        </w:rPr>
-        <w:t xml:space="preserve"> </w:t>
-      </w:r>
-      <w:proofErr w:type="spellStart"/>
-      <w:r>
-        <w:rPr>
-          <w:b/>
-          <w:bCs/>
-          <w:sz w:val="18"/>
-          <w:szCs w:val="18"/>
-        </w:rPr>
-        <w:t>berikut</w:t>
-      </w:r>
-      <w:proofErr w:type="spellEnd"/>
-      <w:r>
-        <w:rPr>
-          <w:b/>
-          <w:bCs/>
-          <w:sz w:val="18"/>
-          <w:szCs w:val="18"/>
-        </w:rPr>
-        <w:t>:</w:t>
+          <w:lang w:val="nb-NO"/>
+        </w:rPr>
+        <w:t xml:space="preserve"> {{TahunTanggal}} telah diserahterimakan perangkat dengan spesifikasi serta syarat-syarat dan ketentuan sebagai berikut:</w:t>
       </w:r>
     </w:p>
     <w:p>
@@ -1689,6 +1354,7 @@
         <w:rPr>
           <w:sz w:val="18"/>
           <w:szCs w:val="18"/>
+          <w:lang w:val="nb-NO"/>
         </w:rPr>
       </w:pPr>
     </w:p>
@@ -1817,6 +1483,7 @@
                   <w:pPr>
                     <w:pStyle w:val="ListParagraph"/>
                     <w:ind w:left="0"/>
+                    <w:jc w:val="center"/>
                     <w:rPr>
                       <w:b/>
                       <w:bCs/>
@@ -1983,6 +1650,7 @@
                   <w:pPr>
                     <w:pStyle w:val="ListParagraph"/>
                     <w:ind w:left="0"/>
+                    <w:jc w:val="center"/>
                     <w:rPr>
                       <w:b/>
                       <w:bCs/>
@@ -2077,7 +1745,6 @@
             <w:pPr>
               <w:pStyle w:val="ListParagraph"/>
               <w:ind w:left="0"/>
-              <w:jc w:val="center"/>
               <w:rPr>
                 <w:b/>
                 <w:bCs/>
@@ -2125,7 +1792,6 @@
             <w:pPr>
               <w:pStyle w:val="ListParagraph"/>
               <w:ind w:left="0"/>
-              <w:jc w:val="center"/>
               <w:rPr>
                 <w:b/>
                 <w:bCs/>
@@ -2159,7 +1825,6 @@
             <w:pPr>
               <w:pStyle w:val="ListParagraph"/>
               <w:ind w:left="0"/>
-              <w:jc w:val="center"/>
               <w:rPr>
                 <w:b/>
                 <w:bCs/>
@@ -2174,7 +1839,6 @@
             <w:pPr>
               <w:pStyle w:val="ListParagraph"/>
               <w:ind w:left="0"/>
-              <w:jc w:val="center"/>
               <w:rPr>
                 <w:b/>
                 <w:bCs/>
@@ -2222,7 +1886,7 @@
                 <w:szCs w:val="18"/>
                 <w:lang w:val="nb-NO"/>
               </w:rPr>
-              <w:t>{{PerangkatNo}}</w:t>
+              <w:t>{{PerangkatNo}}.</w:t>
             </w:r>
           </w:p>
         </w:tc>
@@ -2462,12 +2126,405 @@
           <w:szCs w:val="18"/>
         </w:rPr>
       </w:pPr>
-      <w:r>
-        <w:rPr>
-          <w:sz w:val="18"/>
-          <w:szCs w:val="18"/>
-        </w:rPr>
-        <w:t>Pihak penerima bertanggung jawab sepenuhnya atas peralatan yang digunakannya dan telah membaca dan setuju dengan ketentuan tambahan yang tercantum pada halaman belakang dari lembar bukti penerimaan barang ini (wajib dibaca).</w:t>
+      <w:proofErr w:type="spellStart"/>
+      <w:r>
+        <w:rPr>
+          <w:sz w:val="18"/>
+          <w:szCs w:val="18"/>
+        </w:rPr>
+        <w:t>Pihak</w:t>
+      </w:r>
+      <w:proofErr w:type="spellEnd"/>
+      <w:r>
+        <w:rPr>
+          <w:sz w:val="18"/>
+          <w:szCs w:val="18"/>
+        </w:rPr>
+        <w:t xml:space="preserve"> </w:t>
+      </w:r>
+      <w:proofErr w:type="spellStart"/>
+      <w:r>
+        <w:rPr>
+          <w:sz w:val="18"/>
+          <w:szCs w:val="18"/>
+        </w:rPr>
+        <w:t>penerima</w:t>
+      </w:r>
+      <w:proofErr w:type="spellEnd"/>
+      <w:r>
+        <w:rPr>
+          <w:sz w:val="18"/>
+          <w:szCs w:val="18"/>
+        </w:rPr>
+        <w:t xml:space="preserve"> </w:t>
+      </w:r>
+      <w:proofErr w:type="spellStart"/>
+      <w:r>
+        <w:rPr>
+          <w:sz w:val="18"/>
+          <w:szCs w:val="18"/>
+        </w:rPr>
+        <w:t>bertanggung</w:t>
+      </w:r>
+      <w:proofErr w:type="spellEnd"/>
+      <w:r>
+        <w:rPr>
+          <w:sz w:val="18"/>
+          <w:szCs w:val="18"/>
+        </w:rPr>
+        <w:t xml:space="preserve"> </w:t>
+      </w:r>
+      <w:proofErr w:type="spellStart"/>
+      <w:r>
+        <w:rPr>
+          <w:sz w:val="18"/>
+          <w:szCs w:val="18"/>
+        </w:rPr>
+        <w:t>jawab</w:t>
+      </w:r>
+      <w:proofErr w:type="spellEnd"/>
+      <w:r>
+        <w:rPr>
+          <w:sz w:val="18"/>
+          <w:szCs w:val="18"/>
+        </w:rPr>
+        <w:t xml:space="preserve"> </w:t>
+      </w:r>
+      <w:proofErr w:type="spellStart"/>
+      <w:r>
+        <w:rPr>
+          <w:sz w:val="18"/>
+          <w:szCs w:val="18"/>
+        </w:rPr>
+        <w:t>sepenuhnya</w:t>
+      </w:r>
+      <w:proofErr w:type="spellEnd"/>
+      <w:r>
+        <w:rPr>
+          <w:sz w:val="18"/>
+          <w:szCs w:val="18"/>
+        </w:rPr>
+        <w:t xml:space="preserve"> </w:t>
+      </w:r>
+      <w:proofErr w:type="spellStart"/>
+      <w:r>
+        <w:rPr>
+          <w:sz w:val="18"/>
+          <w:szCs w:val="18"/>
+        </w:rPr>
+        <w:t>atas</w:t>
+      </w:r>
+      <w:proofErr w:type="spellEnd"/>
+      <w:r>
+        <w:rPr>
+          <w:sz w:val="18"/>
+          <w:szCs w:val="18"/>
+        </w:rPr>
+        <w:t xml:space="preserve"> </w:t>
+      </w:r>
+      <w:proofErr w:type="spellStart"/>
+      <w:r>
+        <w:rPr>
+          <w:sz w:val="18"/>
+          <w:szCs w:val="18"/>
+        </w:rPr>
+        <w:t>peralatan</w:t>
+      </w:r>
+      <w:proofErr w:type="spellEnd"/>
+      <w:r>
+        <w:rPr>
+          <w:sz w:val="18"/>
+          <w:szCs w:val="18"/>
+        </w:rPr>
+        <w:t xml:space="preserve"> yang </w:t>
+      </w:r>
+      <w:proofErr w:type="spellStart"/>
+      <w:r>
+        <w:rPr>
+          <w:sz w:val="18"/>
+          <w:szCs w:val="18"/>
+        </w:rPr>
+        <w:t>digunakannya</w:t>
+      </w:r>
+      <w:proofErr w:type="spellEnd"/>
+      <w:r>
+        <w:rPr>
+          <w:sz w:val="18"/>
+          <w:szCs w:val="18"/>
+        </w:rPr>
+        <w:t xml:space="preserve"> dan </w:t>
+      </w:r>
+      <w:proofErr w:type="spellStart"/>
+      <w:r>
+        <w:rPr>
+          <w:sz w:val="18"/>
+          <w:szCs w:val="18"/>
+        </w:rPr>
+        <w:t>telah</w:t>
+      </w:r>
+      <w:proofErr w:type="spellEnd"/>
+      <w:r>
+        <w:rPr>
+          <w:sz w:val="18"/>
+          <w:szCs w:val="18"/>
+        </w:rPr>
+        <w:t xml:space="preserve"> </w:t>
+      </w:r>
+      <w:proofErr w:type="spellStart"/>
+      <w:r>
+        <w:rPr>
+          <w:sz w:val="18"/>
+          <w:szCs w:val="18"/>
+        </w:rPr>
+        <w:t>membaca</w:t>
+      </w:r>
+      <w:proofErr w:type="spellEnd"/>
+      <w:r>
+        <w:rPr>
+          <w:sz w:val="18"/>
+          <w:szCs w:val="18"/>
+        </w:rPr>
+        <w:t xml:space="preserve"> dan </w:t>
+      </w:r>
+      <w:proofErr w:type="spellStart"/>
+      <w:r>
+        <w:rPr>
+          <w:sz w:val="18"/>
+          <w:szCs w:val="18"/>
+        </w:rPr>
+        <w:t>setuju</w:t>
+      </w:r>
+      <w:proofErr w:type="spellEnd"/>
+      <w:r>
+        <w:rPr>
+          <w:sz w:val="18"/>
+          <w:szCs w:val="18"/>
+        </w:rPr>
+        <w:t xml:space="preserve"> </w:t>
+      </w:r>
+      <w:proofErr w:type="spellStart"/>
+      <w:r>
+        <w:rPr>
+          <w:sz w:val="18"/>
+          <w:szCs w:val="18"/>
+        </w:rPr>
+        <w:t>dengan</w:t>
+      </w:r>
+      <w:proofErr w:type="spellEnd"/>
+      <w:r>
+        <w:rPr>
+          <w:sz w:val="18"/>
+          <w:szCs w:val="18"/>
+        </w:rPr>
+        <w:t xml:space="preserve"> </w:t>
+      </w:r>
+      <w:proofErr w:type="spellStart"/>
+      <w:r>
+        <w:rPr>
+          <w:sz w:val="18"/>
+          <w:szCs w:val="18"/>
+        </w:rPr>
+        <w:t>ketentuan</w:t>
+      </w:r>
+      <w:proofErr w:type="spellEnd"/>
+      <w:r>
+        <w:rPr>
+          <w:sz w:val="18"/>
+          <w:szCs w:val="18"/>
+        </w:rPr>
+        <w:t xml:space="preserve"> </w:t>
+      </w:r>
+      <w:proofErr w:type="spellStart"/>
+      <w:r>
+        <w:rPr>
+          <w:sz w:val="18"/>
+          <w:szCs w:val="18"/>
+        </w:rPr>
+        <w:t>tambahan</w:t>
+      </w:r>
+      <w:proofErr w:type="spellEnd"/>
+      <w:r>
+        <w:rPr>
+          <w:sz w:val="18"/>
+          <w:szCs w:val="18"/>
+        </w:rPr>
+        <w:t xml:space="preserve"> yang </w:t>
+      </w:r>
+      <w:proofErr w:type="spellStart"/>
+      <w:r>
+        <w:rPr>
+          <w:sz w:val="18"/>
+          <w:szCs w:val="18"/>
+        </w:rPr>
+        <w:t>tercantum</w:t>
+      </w:r>
+      <w:proofErr w:type="spellEnd"/>
+      <w:r>
+        <w:rPr>
+          <w:sz w:val="18"/>
+          <w:szCs w:val="18"/>
+        </w:rPr>
+        <w:t xml:space="preserve"> pada </w:t>
+      </w:r>
+      <w:proofErr w:type="spellStart"/>
+      <w:r>
+        <w:rPr>
+          <w:sz w:val="18"/>
+          <w:szCs w:val="18"/>
+        </w:rPr>
+        <w:t>halaman</w:t>
+      </w:r>
+      <w:proofErr w:type="spellEnd"/>
+      <w:r>
+        <w:rPr>
+          <w:sz w:val="18"/>
+          <w:szCs w:val="18"/>
+        </w:rPr>
+        <w:t xml:space="preserve"> </w:t>
+      </w:r>
+      <w:proofErr w:type="spellStart"/>
+      <w:r>
+        <w:rPr>
+          <w:sz w:val="18"/>
+          <w:szCs w:val="18"/>
+        </w:rPr>
+        <w:t>belakang</w:t>
+      </w:r>
+      <w:proofErr w:type="spellEnd"/>
+      <w:r>
+        <w:rPr>
+          <w:sz w:val="18"/>
+          <w:szCs w:val="18"/>
+        </w:rPr>
+        <w:t xml:space="preserve"> </w:t>
+      </w:r>
+      <w:proofErr w:type="spellStart"/>
+      <w:r>
+        <w:rPr>
+          <w:sz w:val="18"/>
+          <w:szCs w:val="18"/>
+        </w:rPr>
+        <w:t>dari</w:t>
+      </w:r>
+      <w:proofErr w:type="spellEnd"/>
+      <w:r>
+        <w:rPr>
+          <w:sz w:val="18"/>
+          <w:szCs w:val="18"/>
+        </w:rPr>
+        <w:t xml:space="preserve"> </w:t>
+      </w:r>
+      <w:proofErr w:type="spellStart"/>
+      <w:r>
+        <w:rPr>
+          <w:sz w:val="18"/>
+          <w:szCs w:val="18"/>
+        </w:rPr>
+        <w:t>lembar</w:t>
+      </w:r>
+      <w:proofErr w:type="spellEnd"/>
+      <w:r>
+        <w:rPr>
+          <w:sz w:val="18"/>
+          <w:szCs w:val="18"/>
+        </w:rPr>
+        <w:t xml:space="preserve"> </w:t>
+      </w:r>
+      <w:proofErr w:type="spellStart"/>
+      <w:r>
+        <w:rPr>
+          <w:sz w:val="18"/>
+          <w:szCs w:val="18"/>
+        </w:rPr>
+        <w:t>bukti</w:t>
+      </w:r>
+      <w:proofErr w:type="spellEnd"/>
+      <w:r>
+        <w:rPr>
+          <w:sz w:val="18"/>
+          <w:szCs w:val="18"/>
+        </w:rPr>
+        <w:t xml:space="preserve"> </w:t>
+      </w:r>
+      <w:proofErr w:type="spellStart"/>
+      <w:r>
+        <w:rPr>
+          <w:sz w:val="18"/>
+          <w:szCs w:val="18"/>
+        </w:rPr>
+        <w:t>penerimaan</w:t>
+      </w:r>
+      <w:proofErr w:type="spellEnd"/>
+      <w:r>
+        <w:rPr>
+          <w:sz w:val="18"/>
+          <w:szCs w:val="18"/>
+        </w:rPr>
+        <w:t xml:space="preserve"> </w:t>
+      </w:r>
+      <w:proofErr w:type="spellStart"/>
+      <w:r>
+        <w:rPr>
+          <w:sz w:val="18"/>
+          <w:szCs w:val="18"/>
+        </w:rPr>
+        <w:t>barang</w:t>
+      </w:r>
+      <w:proofErr w:type="spellEnd"/>
+      <w:r>
+        <w:rPr>
+          <w:sz w:val="18"/>
+          <w:szCs w:val="18"/>
+        </w:rPr>
+        <w:t xml:space="preserve"> </w:t>
+      </w:r>
+      <w:proofErr w:type="spellStart"/>
+      <w:r>
+        <w:rPr>
+          <w:sz w:val="18"/>
+          <w:szCs w:val="18"/>
+        </w:rPr>
+        <w:t>ini</w:t>
+      </w:r>
+      <w:proofErr w:type="spellEnd"/>
+      <w:r>
+        <w:rPr>
+          <w:sz w:val="18"/>
+          <w:szCs w:val="18"/>
+        </w:rPr>
+        <w:t xml:space="preserve"> (</w:t>
+      </w:r>
+      <w:proofErr w:type="spellStart"/>
+      <w:r>
+        <w:rPr>
+          <w:sz w:val="18"/>
+          <w:szCs w:val="18"/>
+        </w:rPr>
+        <w:t>wajib</w:t>
+      </w:r>
+      <w:proofErr w:type="spellEnd"/>
+      <w:r>
+        <w:rPr>
+          <w:sz w:val="18"/>
+          <w:szCs w:val="18"/>
+        </w:rPr>
+        <w:t xml:space="preserve"> </w:t>
+      </w:r>
+      <w:proofErr w:type="spellStart"/>
+      <w:r>
+        <w:rPr>
+          <w:sz w:val="18"/>
+          <w:szCs w:val="18"/>
+        </w:rPr>
+        <w:t>dibaca</w:t>
+      </w:r>
+      <w:proofErr w:type="spellEnd"/>
+      <w:r>
+        <w:rPr>
+          <w:sz w:val="18"/>
+          <w:szCs w:val="18"/>
+        </w:rPr>
+        <w:t>).</w:t>
       </w:r>
     </w:p>
     <w:p>
@@ -2498,19 +2555,405 @@
           <w:lang w:val="nb-NO"/>
         </w:rPr>
       </w:pPr>
-      <w:r>
-        <w:rPr>
-          <w:sz w:val="18"/>
-          <w:szCs w:val="18"/>
-        </w:rPr>
-        <w:t xml:space="preserve">Apabila terjadi pencurian/kehilangan perangkat yang diserahkan kepada pemakai/penanggung jawab, maka pemakai/penanggung jawab harus melaporkan kepada Kepolisian dan Sekuriti PERTAMINA dimana </w:t>
-      </w:r>
-      <w:r>
-        <w:rPr>
-          <w:sz w:val="18"/>
-          <w:szCs w:val="18"/>
-        </w:rPr>
-        <w:t xml:space="preserve">terjadi pencurian/kehilangan barang tersebut. </w:t>
+      <w:proofErr w:type="spellStart"/>
+      <w:r>
+        <w:rPr>
+          <w:sz w:val="18"/>
+          <w:szCs w:val="18"/>
+        </w:rPr>
+        <w:t>Apabila</w:t>
+      </w:r>
+      <w:proofErr w:type="spellEnd"/>
+      <w:r>
+        <w:rPr>
+          <w:sz w:val="18"/>
+          <w:szCs w:val="18"/>
+        </w:rPr>
+        <w:t xml:space="preserve"> </w:t>
+      </w:r>
+      <w:proofErr w:type="spellStart"/>
+      <w:r>
+        <w:rPr>
+          <w:sz w:val="18"/>
+          <w:szCs w:val="18"/>
+        </w:rPr>
+        <w:t>terjadi</w:t>
+      </w:r>
+      <w:proofErr w:type="spellEnd"/>
+      <w:r>
+        <w:rPr>
+          <w:sz w:val="18"/>
+          <w:szCs w:val="18"/>
+        </w:rPr>
+        <w:t xml:space="preserve"> </w:t>
+      </w:r>
+      <w:proofErr w:type="spellStart"/>
+      <w:r>
+        <w:rPr>
+          <w:sz w:val="18"/>
+          <w:szCs w:val="18"/>
+        </w:rPr>
+        <w:t>pencurian</w:t>
+      </w:r>
+      <w:proofErr w:type="spellEnd"/>
+      <w:r>
+        <w:rPr>
+          <w:sz w:val="18"/>
+          <w:szCs w:val="18"/>
+        </w:rPr>
+        <w:t>/</w:t>
+      </w:r>
+      <w:proofErr w:type="spellStart"/>
+      <w:r>
+        <w:rPr>
+          <w:sz w:val="18"/>
+          <w:szCs w:val="18"/>
+        </w:rPr>
+        <w:t>kehilangan</w:t>
+      </w:r>
+      <w:proofErr w:type="spellEnd"/>
+      <w:r>
+        <w:rPr>
+          <w:sz w:val="18"/>
+          <w:szCs w:val="18"/>
+        </w:rPr>
+        <w:t xml:space="preserve"> </w:t>
+      </w:r>
+      <w:proofErr w:type="spellStart"/>
+      <w:r>
+        <w:rPr>
+          <w:sz w:val="18"/>
+          <w:szCs w:val="18"/>
+        </w:rPr>
+        <w:t>perangkat</w:t>
+      </w:r>
+      <w:proofErr w:type="spellEnd"/>
+      <w:r>
+        <w:rPr>
+          <w:sz w:val="18"/>
+          <w:szCs w:val="18"/>
+        </w:rPr>
+        <w:t xml:space="preserve"> yang </w:t>
+      </w:r>
+      <w:proofErr w:type="spellStart"/>
+      <w:r>
+        <w:rPr>
+          <w:sz w:val="18"/>
+          <w:szCs w:val="18"/>
+        </w:rPr>
+        <w:t>diserahkan</w:t>
+      </w:r>
+      <w:proofErr w:type="spellEnd"/>
+      <w:r>
+        <w:rPr>
+          <w:sz w:val="18"/>
+          <w:szCs w:val="18"/>
+        </w:rPr>
+        <w:t xml:space="preserve"> </w:t>
+      </w:r>
+      <w:proofErr w:type="spellStart"/>
+      <w:r>
+        <w:rPr>
+          <w:sz w:val="18"/>
+          <w:szCs w:val="18"/>
+        </w:rPr>
+        <w:t>kepada</w:t>
+      </w:r>
+      <w:proofErr w:type="spellEnd"/>
+      <w:r>
+        <w:rPr>
+          <w:sz w:val="18"/>
+          <w:szCs w:val="18"/>
+        </w:rPr>
+        <w:t xml:space="preserve"> </w:t>
+      </w:r>
+      <w:proofErr w:type="spellStart"/>
+      <w:r>
+        <w:rPr>
+          <w:sz w:val="18"/>
+          <w:szCs w:val="18"/>
+        </w:rPr>
+        <w:t>pemakai</w:t>
+      </w:r>
+      <w:proofErr w:type="spellEnd"/>
+      <w:r>
+        <w:rPr>
+          <w:sz w:val="18"/>
+          <w:szCs w:val="18"/>
+        </w:rPr>
+        <w:t>/</w:t>
+      </w:r>
+      <w:proofErr w:type="spellStart"/>
+      <w:r>
+        <w:rPr>
+          <w:sz w:val="18"/>
+          <w:szCs w:val="18"/>
+        </w:rPr>
+        <w:t>penanggung</w:t>
+      </w:r>
+      <w:proofErr w:type="spellEnd"/>
+      <w:r>
+        <w:rPr>
+          <w:sz w:val="18"/>
+          <w:szCs w:val="18"/>
+        </w:rPr>
+        <w:t xml:space="preserve"> </w:t>
+      </w:r>
+      <w:proofErr w:type="spellStart"/>
+      <w:r>
+        <w:rPr>
+          <w:sz w:val="18"/>
+          <w:szCs w:val="18"/>
+        </w:rPr>
+        <w:t>jawab</w:t>
+      </w:r>
+      <w:proofErr w:type="spellEnd"/>
+      <w:r>
+        <w:rPr>
+          <w:sz w:val="18"/>
+          <w:szCs w:val="18"/>
+        </w:rPr>
+        <w:t xml:space="preserve">, </w:t>
+      </w:r>
+      <w:proofErr w:type="spellStart"/>
+      <w:r>
+        <w:rPr>
+          <w:sz w:val="18"/>
+          <w:szCs w:val="18"/>
+        </w:rPr>
+        <w:t>maka</w:t>
+      </w:r>
+      <w:proofErr w:type="spellEnd"/>
+      <w:r>
+        <w:rPr>
+          <w:sz w:val="18"/>
+          <w:szCs w:val="18"/>
+        </w:rPr>
+        <w:t xml:space="preserve"> </w:t>
+      </w:r>
+      <w:proofErr w:type="spellStart"/>
+      <w:r>
+        <w:rPr>
+          <w:sz w:val="18"/>
+          <w:szCs w:val="18"/>
+        </w:rPr>
+        <w:t>pemakai</w:t>
+      </w:r>
+      <w:proofErr w:type="spellEnd"/>
+      <w:r>
+        <w:rPr>
+          <w:sz w:val="18"/>
+          <w:szCs w:val="18"/>
+        </w:rPr>
+        <w:t>/</w:t>
+      </w:r>
+      <w:proofErr w:type="spellStart"/>
+      <w:r>
+        <w:rPr>
+          <w:sz w:val="18"/>
+          <w:szCs w:val="18"/>
+        </w:rPr>
+        <w:t>penanggung</w:t>
+      </w:r>
+      <w:proofErr w:type="spellEnd"/>
+      <w:r>
+        <w:rPr>
+          <w:sz w:val="18"/>
+          <w:szCs w:val="18"/>
+        </w:rPr>
+        <w:t xml:space="preserve"> </w:t>
+      </w:r>
+      <w:proofErr w:type="spellStart"/>
+      <w:r>
+        <w:rPr>
+          <w:sz w:val="18"/>
+          <w:szCs w:val="18"/>
+        </w:rPr>
+        <w:t>jawab</w:t>
+      </w:r>
+      <w:proofErr w:type="spellEnd"/>
+      <w:r>
+        <w:rPr>
+          <w:sz w:val="18"/>
+          <w:szCs w:val="18"/>
+        </w:rPr>
+        <w:t xml:space="preserve"> </w:t>
+      </w:r>
+      <w:proofErr w:type="spellStart"/>
+      <w:r>
+        <w:rPr>
+          <w:sz w:val="18"/>
+          <w:szCs w:val="18"/>
+        </w:rPr>
+        <w:t>harus</w:t>
+      </w:r>
+      <w:proofErr w:type="spellEnd"/>
+      <w:r>
+        <w:rPr>
+          <w:sz w:val="18"/>
+          <w:szCs w:val="18"/>
+        </w:rPr>
+        <w:t xml:space="preserve"> </w:t>
+      </w:r>
+      <w:proofErr w:type="spellStart"/>
+      <w:r>
+        <w:rPr>
+          <w:sz w:val="18"/>
+          <w:szCs w:val="18"/>
+        </w:rPr>
+        <w:t>melaporkan</w:t>
+      </w:r>
+      <w:proofErr w:type="spellEnd"/>
+      <w:r>
+        <w:rPr>
+          <w:sz w:val="18"/>
+          <w:szCs w:val="18"/>
+        </w:rPr>
+        <w:t xml:space="preserve"> </w:t>
+      </w:r>
+      <w:proofErr w:type="spellStart"/>
+      <w:r>
+        <w:rPr>
+          <w:sz w:val="18"/>
+          <w:szCs w:val="18"/>
+        </w:rPr>
+        <w:t>kepada</w:t>
+      </w:r>
+      <w:proofErr w:type="spellEnd"/>
+      <w:r>
+        <w:rPr>
+          <w:sz w:val="18"/>
+          <w:szCs w:val="18"/>
+        </w:rPr>
+        <w:t xml:space="preserve"> </w:t>
+      </w:r>
+      <w:proofErr w:type="spellStart"/>
+      <w:r>
+        <w:rPr>
+          <w:sz w:val="18"/>
+          <w:szCs w:val="18"/>
+        </w:rPr>
+        <w:t>Kepolisian</w:t>
+      </w:r>
+      <w:proofErr w:type="spellEnd"/>
+      <w:r>
+        <w:rPr>
+          <w:sz w:val="18"/>
+          <w:szCs w:val="18"/>
+        </w:rPr>
+        <w:t xml:space="preserve"> dan </w:t>
+      </w:r>
+      <w:proofErr w:type="spellStart"/>
+      <w:r>
+        <w:rPr>
+          <w:sz w:val="18"/>
+          <w:szCs w:val="18"/>
+        </w:rPr>
+        <w:t>Sekuriti</w:t>
+      </w:r>
+      <w:proofErr w:type="spellEnd"/>
+      <w:r>
+        <w:rPr>
+          <w:sz w:val="18"/>
+          <w:szCs w:val="18"/>
+        </w:rPr>
+        <w:t xml:space="preserve"> PERTAMINA </w:t>
+      </w:r>
+      <w:proofErr w:type="spellStart"/>
+      <w:r>
+        <w:rPr>
+          <w:sz w:val="18"/>
+          <w:szCs w:val="18"/>
+        </w:rPr>
+        <w:t>dimana</w:t>
+      </w:r>
+      <w:proofErr w:type="spellEnd"/>
+      <w:r>
+        <w:rPr>
+          <w:sz w:val="18"/>
+          <w:szCs w:val="18"/>
+        </w:rPr>
+        <w:t xml:space="preserve"> </w:t>
+      </w:r>
+      <w:proofErr w:type="spellStart"/>
+      <w:r>
+        <w:rPr>
+          <w:sz w:val="18"/>
+          <w:szCs w:val="18"/>
+        </w:rPr>
+        <w:t>terjadi</w:t>
+      </w:r>
+      <w:proofErr w:type="spellEnd"/>
+      <w:r>
+        <w:rPr>
+          <w:sz w:val="18"/>
+          <w:szCs w:val="18"/>
+        </w:rPr>
+        <w:t xml:space="preserve"> </w:t>
+      </w:r>
+      <w:proofErr w:type="spellStart"/>
+      <w:r>
+        <w:rPr>
+          <w:sz w:val="18"/>
+          <w:szCs w:val="18"/>
+        </w:rPr>
+        <w:t>pencurian</w:t>
+      </w:r>
+      <w:proofErr w:type="spellEnd"/>
+      <w:r>
+        <w:rPr>
+          <w:sz w:val="18"/>
+          <w:szCs w:val="18"/>
+        </w:rPr>
+        <w:t>/</w:t>
+      </w:r>
+      <w:proofErr w:type="spellStart"/>
+      <w:r>
+        <w:rPr>
+          <w:sz w:val="18"/>
+          <w:szCs w:val="18"/>
+        </w:rPr>
+        <w:t>kehilangan</w:t>
+      </w:r>
+      <w:proofErr w:type="spellEnd"/>
+      <w:r>
+        <w:rPr>
+          <w:sz w:val="18"/>
+          <w:szCs w:val="18"/>
+        </w:rPr>
+        <w:t xml:space="preserve"> </w:t>
+      </w:r>
+      <w:proofErr w:type="spellStart"/>
+      <w:r>
+        <w:rPr>
+          <w:sz w:val="18"/>
+          <w:szCs w:val="18"/>
+        </w:rPr>
+        <w:t>barang</w:t>
+      </w:r>
+      <w:proofErr w:type="spellEnd"/>
+      <w:r>
+        <w:rPr>
+          <w:sz w:val="18"/>
+          <w:szCs w:val="18"/>
+        </w:rPr>
+        <w:t xml:space="preserve"> </w:t>
+      </w:r>
+      <w:proofErr w:type="spellStart"/>
+      <w:r>
+        <w:rPr>
+          <w:sz w:val="18"/>
+          <w:szCs w:val="18"/>
+        </w:rPr>
+        <w:t>tersebut</w:t>
+      </w:r>
+      <w:proofErr w:type="spellEnd"/>
+      <w:r>
+        <w:rPr>
+          <w:sz w:val="18"/>
+          <w:szCs w:val="18"/>
+        </w:rPr>
+        <w:t xml:space="preserve">. </w:t>
       </w:r>
       <w:r>
         <w:rPr>
@@ -2659,6 +3102,7 @@
           <w:szCs w:val="18"/>
           <w:lang w:val="nb-NO"/>
         </w:rPr>
+        <w:lastRenderedPageBreak/>
         <w:t>Kami sebagai Penerima/Penanggung Jawab telah membaca, memahami, dan menerima semua ketentuan Perusahaan tersebut.</w:t>
       </w:r>
     </w:p>
@@ -2853,38 +3297,14 @@
               <w:pStyle w:val="ListParagraph"/>
               <w:ind w:left="0"/>
               <w:rPr>
-                <w:sz w:val="18"/>
-                <w:szCs w:val="18"/>
-                <w:u w:val="single"/>
+                <w:noProof/>
+                <w:sz w:val="18"/>
+                <w:szCs w:val="18"/>
                 <w:lang w:val="nb-NO"/>
               </w:rPr>
             </w:pPr>
             <w:r>
               <w:t>{{SIG_MENYERAHKAN}}</w:t>
-            </w:r>
-          </w:p>
-          <w:p>
-            <w:pPr>
-              <w:pStyle w:val="ListParagraph"/>
-              <w:ind w:left="0"/>
-              <w:rPr>
-                <w:b/>
-                <w:bCs/>
-                <w:noProof/>
-                <w:sz w:val="18"/>
-                <w:szCs w:val="18"/>
-                <w:u w:val="single"/>
-                <w:lang w:val="nb-NO"/>
-              </w:rPr>
-            </w:pPr>
-            <w:r>
-              <w:rPr>
-                <w:sz w:val="18"/>
-                <w:szCs w:val="18"/>
-                <w:u w:val="single"/>
-                <w:lang w:val="nb-NO"/>
-              </w:rPr>
-              <w:t>{{Menyerahkan}}</w:t>
             </w:r>
           </w:p>
         </w:tc>
@@ -2897,38 +3317,14 @@
               <w:pStyle w:val="ListParagraph"/>
               <w:ind w:left="0"/>
               <w:rPr>
-                <w:sz w:val="18"/>
-                <w:szCs w:val="18"/>
-                <w:u w:val="single"/>
+                <w:noProof/>
+                <w:sz w:val="18"/>
+                <w:szCs w:val="18"/>
                 <w:lang w:val="nb-NO"/>
               </w:rPr>
             </w:pPr>
             <w:r>
               <w:t>{{SIG_APPROVER}}</w:t>
-            </w:r>
-          </w:p>
-          <w:p>
-            <w:pPr>
-              <w:pStyle w:val="ListParagraph"/>
-              <w:ind w:left="0"/>
-              <w:rPr>
-                <w:b/>
-                <w:bCs/>
-                <w:noProof/>
-                <w:sz w:val="18"/>
-                <w:szCs w:val="18"/>
-                <w:u w:val="single"/>
-                <w:lang w:val="nb-NO"/>
-              </w:rPr>
-            </w:pPr>
-            <w:r>
-              <w:rPr>
-                <w:sz w:val="18"/>
-                <w:szCs w:val="18"/>
-                <w:u w:val="single"/>
-                <w:lang w:val="nb-NO"/>
-              </w:rPr>
-              <w:t>{{Approver}}</w:t>
             </w:r>
           </w:p>
         </w:tc>
@@ -2941,6 +3337,31 @@
               <w:pStyle w:val="ListParagraph"/>
               <w:ind w:left="0"/>
               <w:rPr>
+                <w:noProof/>
+                <w:sz w:val="18"/>
+                <w:szCs w:val="18"/>
+                <w:lang w:val="nb-NO"/>
+              </w:rPr>
+            </w:pPr>
+            <w:r>
+              <w:t>{{SIG_PJ}}</w:t>
+            </w:r>
+          </w:p>
+        </w:tc>
+      </w:tr>
+      <w:tr>
+        <w:tc>
+          <w:tcPr>
+            <w:tcW w:w="3096" w:type="dxa"/>
+          </w:tcPr>
+          <w:p>
+            <w:pPr>
+              <w:pStyle w:val="ListParagraph"/>
+              <w:ind w:left="0"/>
+              <w:rPr>
+                <w:b/>
+                <w:bCs/>
+                <w:noProof/>
                 <w:sz w:val="18"/>
                 <w:szCs w:val="18"/>
                 <w:u w:val="single"/>
@@ -2948,9 +3369,49 @@
               </w:rPr>
             </w:pPr>
             <w:r>
-              <w:t>{{SIG_PJ}}</w:t>
-            </w:r>
-          </w:p>
+              <w:rPr>
+                <w:sz w:val="18"/>
+                <w:szCs w:val="18"/>
+                <w:u w:val="single"/>
+                <w:lang w:val="nb-NO"/>
+              </w:rPr>
+              <w:t>{{Menyerahkan}}</w:t>
+            </w:r>
+          </w:p>
+        </w:tc>
+        <w:tc>
+          <w:tcPr>
+            <w:tcW w:w="3087" w:type="dxa"/>
+          </w:tcPr>
+          <w:p>
+            <w:pPr>
+              <w:pStyle w:val="ListParagraph"/>
+              <w:ind w:left="0"/>
+              <w:rPr>
+                <w:b/>
+                <w:bCs/>
+                <w:noProof/>
+                <w:sz w:val="18"/>
+                <w:szCs w:val="18"/>
+                <w:u w:val="single"/>
+                <w:lang w:val="nb-NO"/>
+              </w:rPr>
+            </w:pPr>
+            <w:r>
+              <w:rPr>
+                <w:sz w:val="18"/>
+                <w:szCs w:val="18"/>
+                <w:u w:val="single"/>
+                <w:lang w:val="nb-NO"/>
+              </w:rPr>
+              <w:t>{{Approver}}</w:t>
+            </w:r>
+          </w:p>
+        </w:tc>
+        <w:tc>
+          <w:tcPr>
+            <w:tcW w:w="3085" w:type="dxa"/>
+          </w:tcPr>
           <w:p>
             <w:pPr>
               <w:pStyle w:val="ListParagraph"/>
@@ -3062,7 +3523,7 @@
           <w:szCs w:val="18"/>
           <w:lang w:val="nb-NO"/>
         </w:rPr>
-        <w:t xml:space="preserve"> Mouse</w:t>
+        <w:t xml:space="preserve"> {{JenisPerangkat}}</w:t>
       </w:r>
     </w:p>
     <w:p>
@@ -3073,12 +3534,53 @@
           <w:szCs w:val="18"/>
         </w:rPr>
       </w:pPr>
-      <w:r>
-        <w:rPr>
-          <w:sz w:val="18"/>
-          <w:szCs w:val="18"/>
-        </w:rPr>
-        <w:t xml:space="preserve">Sesuai dengan Tiket di My SSC No. </w:t>
+      <w:proofErr w:type="spellStart"/>
+      <w:r>
+        <w:rPr>
+          <w:sz w:val="18"/>
+          <w:szCs w:val="18"/>
+        </w:rPr>
+        <w:t>Sesuai</w:t>
+      </w:r>
+      <w:proofErr w:type="spellEnd"/>
+      <w:r>
+        <w:rPr>
+          <w:sz w:val="18"/>
+          <w:szCs w:val="18"/>
+        </w:rPr>
+        <w:t xml:space="preserve"> </w:t>
+      </w:r>
+      <w:proofErr w:type="spellStart"/>
+      <w:r>
+        <w:rPr>
+          <w:sz w:val="18"/>
+          <w:szCs w:val="18"/>
+        </w:rPr>
+        <w:t>dengan</w:t>
+      </w:r>
+      <w:proofErr w:type="spellEnd"/>
+      <w:r>
+        <w:rPr>
+          <w:sz w:val="18"/>
+          <w:szCs w:val="18"/>
+        </w:rPr>
+        <w:t xml:space="preserve"> </w:t>
+      </w:r>
+      <w:proofErr w:type="spellStart"/>
+      <w:r>
+        <w:rPr>
+          <w:sz w:val="18"/>
+          <w:szCs w:val="18"/>
+        </w:rPr>
+        <w:t>Tiket</w:t>
+      </w:r>
+      <w:proofErr w:type="spellEnd"/>
+      <w:r>
+        <w:rPr>
+          <w:sz w:val="18"/>
+          <w:szCs w:val="18"/>
+        </w:rPr>
+        <w:t xml:space="preserve"> di My SSC No. </w:t>
       </w:r>
       <w:r>
         <w:rPr>
@@ -3109,8 +3611,17 @@
           <w:sz w:val="18"/>
           <w:szCs w:val="18"/>
         </w:rPr>
-        <w:t>{{FungsiPJ}}</w:t>
-      </w:r>
+        <w:t xml:space="preserve">{{FungsiPJ}}</w:t>
+      </w:r>
+      <w:proofErr w:type="spellStart"/>
+      <w:r>
+        <w:rPr>
+          <w:sz w:val="18"/>
+          <w:szCs w:val="18"/>
+        </w:rPr>
+        <w:t/>
+      </w:r>
+      <w:proofErr w:type="spellEnd"/>
     </w:p>
     <w:p>
       <w:pPr>
@@ -3205,40 +3716,7 @@
 </w:document>
 </file>
 
-<file path=word\fontTable.xml><?xml version="1.0" encoding="utf-8"?>
-<w:fonts xmlns:mc="http://schemas.openxmlformats.org/markup-compatibility/2006" xmlns:r="http://schemas.openxmlformats.org/officeDocument/2006/relationships" xmlns:w="http://schemas.openxmlformats.org/wordprocessingml/2006/main" xmlns:w14="http://schemas.microsoft.com/office/word/2010/wordml" xmlns:w15="http://schemas.microsoft.com/office/word/2012/wordml" xmlns:w16cex="http://schemas.microsoft.com/office/word/2018/wordml/cex" xmlns:w16cid="http://schemas.microsoft.com/office/word/2016/wordml/cid" xmlns:w16="http://schemas.microsoft.com/office/word/2018/wordml" xmlns:w16du="http://schemas.microsoft.com/office/word/2023/wordml/word16du" xmlns:w16sdtdh="http://schemas.microsoft.com/office/word/2020/wordml/sdtdatahash" xmlns:w16sdtfl="http://schemas.microsoft.com/office/word/2024/wordml/sdtformatlock" xmlns:w16se="http://schemas.microsoft.com/office/word/2015/wordml/symex" mc:Ignorable="w14 w15 w16se w16cid w16 w16cex w16sdtdh w16sdtfl w16du">
-  <w:font w:name="Calibri">
-    <w:panose1 w:val="020F0502020204030204"/>
-    <w:charset w:val="00"/>
-    <w:family w:val="swiss"/>
-    <w:pitch w:val="variable"/>
-    <w:sig w:usb0="E4002EFF" w:usb1="C200247B" w:usb2="00000009" w:usb3="00000000" w:csb0="000001FF" w:csb1="00000000"/>
-  </w:font>
-  <w:font w:name="Times New Roman">
-    <w:panose1 w:val="02020603050405020304"/>
-    <w:charset w:val="00"/>
-    <w:family w:val="roman"/>
-    <w:pitch w:val="variable"/>
-    <w:sig w:usb0="E0002EFF" w:usb1="C000785B" w:usb2="00000009" w:usb3="00000000" w:csb0="000001FF" w:csb1="00000000"/>
-  </w:font>
-  <w:font w:name="Arial">
-    <w:panose1 w:val="020B0604020202020204"/>
-    <w:charset w:val="00"/>
-    <w:family w:val="swiss"/>
-    <w:pitch w:val="variable"/>
-    <w:sig w:usb0="E0002EFF" w:usb1="C000785B" w:usb2="00000009" w:usb3="00000000" w:csb0="000001FF" w:csb1="00000000"/>
-  </w:font>
-  <w:font w:name="Calibri Light">
-    <w:panose1 w:val="020F0302020204030204"/>
-    <w:charset w:val="00"/>
-    <w:family w:val="swiss"/>
-    <w:pitch w:val="variable"/>
-    <w:sig w:usb0="E4002EFF" w:usb1="C200247B" w:usb2="00000009" w:usb3="00000000" w:csb0="000001FF" w:csb1="00000000"/>
-  </w:font>
-</w:fonts>
-</file>
-
-<file path=word\numbering.xml><?xml version="1.0" encoding="utf-8"?>
+<file path=word/numbering.xml><?xml version="1.0" encoding="utf-8"?>
 <w:numbering xmlns:wpc="http://schemas.microsoft.com/office/word/2010/wordprocessingCanvas" xmlns:cx="http://schemas.microsoft.com/office/drawing/2014/chartex" xmlns:cx1="http://schemas.microsoft.com/office/drawing/2015/9/8/chartex" xmlns:cx2="http://schemas.microsoft.com/office/drawing/2015/10/21/chartex" xmlns:cx3="http://schemas.microsoft.com/office/drawing/2016/5/9/chartex" xmlns:cx4="http://schemas.microsoft.com/office/drawing/2016/5/10/chartex" xmlns:cx5="http://schemas.microsoft.com/office/drawing/2016/5/11/chartex" xmlns:cx6="http://schemas.microsoft.com/office/drawing/2016/5/12/chartex" xmlns:cx7="http://schemas.microsoft.com/office/drawing/2016/5/13/chartex" xmlns:cx8="http://schemas.microsoft.com/office/drawing/2016/5/14/chartex" xmlns:mc="http://schemas.openxmlformats.org/markup-compatibility/2006" xmlns:aink="http://schemas.microsoft.com/office/drawing/2016/ink" xmlns:am3d="http://schemas.microsoft.com/office/drawing/2017/model3d" xmlns:o="urn:schemas-microsoft-com:office:office" xmlns:oel="http://schemas.microsoft.com/office/2019/extlst" xmlns:r="http://schemas.openxmlformats.org/officeDocument/2006/relationships" xmlns:m="http://schemas.openxmlformats.org/officeDocument/2006/math" xmlns:v="urn:schemas-microsoft-com:vml" xmlns:wp14="http://schemas.microsoft.com/office/word/2010/wordprocessingDrawing" xmlns:wp="http://schemas.openxmlformats.org/drawingml/2006/wordprocessingDrawing" xmlns:w10="urn:schemas-microsoft-com:office:word" xmlns:w="http://schemas.openxmlformats.org/wordprocessingml/2006/main" xmlns:w14="http://schemas.microsoft.com/office/word/2010/wordml" xmlns:w15="http://schemas.microsoft.com/office/word/2012/wordml" xmlns:w16cex="http://schemas.microsoft.com/office/word/2018/wordml/cex" xmlns:w16cid="http://schemas.microsoft.com/office/word/2016/wordml/cid" xmlns:w16="http://schemas.microsoft.com/office/word/2018/wordml" xmlns:w16du="http://schemas.microsoft.com/office/word/2023/wordml/word16du" xmlns:w16sdtdh="http://schemas.microsoft.com/office/word/2020/wordml/sdtdatahash" xmlns:w16sdtfl="http://schemas.microsoft.com/office/word/2024/wordml/sdtformatlock" xmlns:w16se="http://schemas.microsoft.com/office/word/2015/wordml/symex" xmlns:wpg="http://schemas.microsoft.com/office/word/2010/wordprocessingGroup" xmlns:wpi="http://schemas.microsoft.com/office/word/2010/wordprocessingInk" xmlns:wne="http://schemas.microsoft.com/office/word/2006/wordml" xmlns:wps="http://schemas.microsoft.com/office/word/2010/wordprocessingShape" mc:Ignorable="w14 w15 w16se w16cid w16 w16cex w16sdtdh w16sdtfl w16du wp14">
   <w:abstractNum w:abstractNumId="0" w15:restartNumberingAfterBreak="0">
     <w:nsid w:val="23720D96"/>
@@ -3332,78 +3810,7 @@
 </w:numbering>
 </file>
 
-<file path=word\settings.xml><?xml version="1.0" encoding="utf-8"?>
-<w:settings xmlns:mc="http://schemas.openxmlformats.org/markup-compatibility/2006" xmlns:o="urn:schemas-microsoft-com:office:office" xmlns:r="http://schemas.openxmlformats.org/officeDocument/2006/relationships" xmlns:m="http://schemas.openxmlformats.org/officeDocument/2006/math" xmlns:v="urn:schemas-microsoft-com:vml" xmlns:w10="urn:schemas-microsoft-com:office:word" xmlns:w="http://schemas.openxmlformats.org/wordprocessingml/2006/main" xmlns:w14="http://schemas.microsoft.com/office/word/2010/wordml" xmlns:w15="http://schemas.microsoft.com/office/word/2012/wordml" xmlns:w16cex="http://schemas.microsoft.com/office/word/2018/wordml/cex" xmlns:w16cid="http://schemas.microsoft.com/office/word/2016/wordml/cid" xmlns:w16="http://schemas.microsoft.com/office/word/2018/wordml" xmlns:w16du="http://schemas.microsoft.com/office/word/2023/wordml/word16du" xmlns:w16sdtdh="http://schemas.microsoft.com/office/word/2020/wordml/sdtdatahash" xmlns:w16sdtfl="http://schemas.microsoft.com/office/word/2024/wordml/sdtformatlock" xmlns:w16se="http://schemas.microsoft.com/office/word/2015/wordml/symex" xmlns:sl="http://schemas.openxmlformats.org/schemaLibrary/2006/main" mc:Ignorable="w14 w15 w16se w16cid w16 w16cex w16sdtdh w16sdtfl w16du">
-  <w:zoom w:percent="110"/>
-  <w:proofState w:spelling="clean" w:grammar="clean"/>
-  <w:defaultTabStop w:val="720"/>
-  <w:characterSpacingControl w:val="doNotCompress"/>
-  <w:compat>
-    <w:compatSetting w:name="compatibilityMode" w:uri="http://schemas.microsoft.com/office/word" w:val="15"/>
-    <w:compatSetting w:name="overrideTableStyleFontSizeAndJustification" w:uri="http://schemas.microsoft.com/office/word" w:val="1"/>
-    <w:compatSetting w:name="enableOpenTypeFeatures" w:uri="http://schemas.microsoft.com/office/word" w:val="1"/>
-    <w:compatSetting w:name="doNotFlipMirrorIndents" w:uri="http://schemas.microsoft.com/office/word" w:val="1"/>
-    <w:compatSetting w:name="differentiateMultirowTableHeaders" w:uri="http://schemas.microsoft.com/office/word" w:val="1"/>
-    <w:compatSetting w:name="useWord2013TrackBottomHyphenation" w:uri="http://schemas.microsoft.com/office/word" w:val="0"/>
-  </w:compat>
-  <w:rsids>
-    <w:rsidRoot w:val="00610B46"/>
-    <w:rsid w:val="001D00D9"/>
-    <w:rsid w:val="00233D1D"/>
-    <w:rsid w:val="002C3EA6"/>
-    <w:rsid w:val="00324901"/>
-    <w:rsid w:val="00387FDB"/>
-    <w:rsid w:val="00481687"/>
-    <w:rsid w:val="005D79EC"/>
-    <w:rsid w:val="00610B46"/>
-    <w:rsid w:val="006E2F03"/>
-    <w:rsid w:val="007317E2"/>
-    <w:rsid w:val="008956C1"/>
-    <w:rsid w:val="008C0A31"/>
-    <w:rsid w:val="0090600A"/>
-    <w:rsid w:val="0095253E"/>
-    <w:rsid w:val="009C2FE8"/>
-    <w:rsid w:val="009F52CF"/>
-    <w:rsid w:val="00B91EB6"/>
-    <w:rsid w:val="00C9298E"/>
-    <w:rsid w:val="00D836BE"/>
-    <w:rsid w:val="00E008A8"/>
-    <w:rsid w:val="00EA6543"/>
-    <w:rsid w:val="00F55E55"/>
-    <w:rsid w:val="00F611BC"/>
-    <w:rsid w:val="00F61E1C"/>
-    <w:rsid w:val="00FB4080"/>
-  </w:rsids>
-  <m:mathPr>
-    <m:mathFont m:val="Cambria Math"/>
-    <m:brkBin m:val="before"/>
-    <m:brkBinSub m:val="--"/>
-    <m:smallFrac m:val="0"/>
-    <m:dispDef/>
-    <m:lMargin m:val="0"/>
-    <m:rMargin m:val="0"/>
-    <m:defJc m:val="centerGroup"/>
-    <m:wrapIndent m:val="1440"/>
-    <m:intLim m:val="subSup"/>
-    <m:naryLim m:val="undOvr"/>
-  </m:mathPr>
-  <w:themeFontLang w:val="en-US"/>
-  <w:clrSchemeMapping w:bg1="light1" w:t1="dark1" w:bg2="light2" w:t2="dark2" w:accent1="accent1" w:accent2="accent2" w:accent3="accent3" w:accent4="accent4" w:accent5="accent5" w:accent6="accent6" w:hyperlink="hyperlink" w:followedHyperlink="followedHyperlink"/>
-  <w:shapeDefaults>
-    <o:shapedefaults v:ext="edit" spidmax="1026"/>
-    <o:shapelayout v:ext="edit">
-      <o:idmap v:ext="edit" data="1"/>
-    </o:shapelayout>
-  </w:shapeDefaults>
-  <w:decimalSymbol w:val="."/>
-  <w:listSeparator w:val=","/>
-  <w14:docId w14:val="689FFE78"/>
-  <w15:chartTrackingRefBased/>
-  <w15:docId w15:val="{2D6EA1CC-1A9E-4D27-AF7C-881D61228F06}"/>
-</w:settings>
-</file>
-
-<file path=word\styles.xml><?xml version="1.0" encoding="utf-8"?>
+<file path=word/styles.xml><?xml version="1.0" encoding="utf-8"?>
 <w:styles xmlns:mc="http://schemas.openxmlformats.org/markup-compatibility/2006" xmlns:r="http://schemas.openxmlformats.org/officeDocument/2006/relationships" xmlns:w="http://schemas.openxmlformats.org/wordprocessingml/2006/main" xmlns:w14="http://schemas.microsoft.com/office/word/2010/wordml" xmlns:w15="http://schemas.microsoft.com/office/word/2012/wordml" xmlns:w16cex="http://schemas.microsoft.com/office/word/2018/wordml/cex" xmlns:w16cid="http://schemas.microsoft.com/office/word/2016/wordml/cid" xmlns:w16="http://schemas.microsoft.com/office/word/2018/wordml" xmlns:w16du="http://schemas.microsoft.com/office/word/2023/wordml/word16du" xmlns:w16sdtdh="http://schemas.microsoft.com/office/word/2020/wordml/sdtdatahash" xmlns:w16sdtfl="http://schemas.microsoft.com/office/word/2024/wordml/sdtformatlock" xmlns:w16se="http://schemas.microsoft.com/office/word/2015/wordml/symex" mc:Ignorable="w14 w15 w16se w16cid w16 w16cex w16sdtdh w16sdtfl w16du">
   <w:docDefaults>
     <w:rPrDefault>
@@ -4351,7 +4758,7 @@
 </w:styles>
 </file>
 
-<file path=word\theme\theme1.xml><?xml version="1.0" encoding="utf-8"?>
+<file path=word/theme/theme1.xml><?xml version="1.0" encoding="utf-8"?>
 <a:theme xmlns:a="http://schemas.openxmlformats.org/drawingml/2006/main" name="Office Theme">
   <a:themeElements>
     <a:clrScheme name="Office">
@@ -4644,11 +5051,4 @@
     </a:ext>
   </a:extLst>
 </a:theme>
-</file>
-
-<file path=word\webSettings.xml><?xml version="1.0" encoding="utf-8"?>
-<w:webSettings xmlns:mc="http://schemas.openxmlformats.org/markup-compatibility/2006" xmlns:r="http://schemas.openxmlformats.org/officeDocument/2006/relationships" xmlns:w="http://schemas.openxmlformats.org/wordprocessingml/2006/main" xmlns:w14="http://schemas.microsoft.com/office/word/2010/wordml" xmlns:w15="http://schemas.microsoft.com/office/word/2012/wordml" xmlns:w16cex="http://schemas.microsoft.com/office/word/2018/wordml/cex" xmlns:w16cid="http://schemas.microsoft.com/office/word/2016/wordml/cid" xmlns:w16="http://schemas.microsoft.com/office/word/2018/wordml" xmlns:w16du="http://schemas.microsoft.com/office/word/2023/wordml/word16du" xmlns:w16sdtdh="http://schemas.microsoft.com/office/word/2020/wordml/sdtdatahash" xmlns:w16sdtfl="http://schemas.microsoft.com/office/word/2024/wordml/sdtformatlock" xmlns:w16se="http://schemas.microsoft.com/office/word/2015/wordml/symex" mc:Ignorable="w14 w15 w16se w16cid w16 w16cex w16sdtdh w16sdtfl w16du">
-  <w:optimizeForBrowser/>
-  <w:allowPNG/>
-</w:webSettings>
 </file>
</xml_diff>